<commit_message>
Make PRA and BSCR operator guides self-contained
</commit_message>
<xml_diff>
--- a/docs/generated/Global-Exposures-Jan-2026.docx
+++ b/docs/generated/Global-Exposures-Jan-2026.docx
@@ -283,13 +283,13 @@
       </w:r>
     </w:p>
     <w:bookmarkEnd w:id="12"/>
-    <w:bookmarkStart w:id="13" w:name="X189dcd17226b6112b7f37340505f9969604bfb4"/>
+    <w:bookmarkStart w:id="13" w:name="Xc487381527629c5b15fdb5b1c0eebcad5867431"/>
     <w:p>
       <w:pPr>
         <w:pStyle w:val="Heading2"/>
       </w:pPr>
       <w:r>
-        <w:t xml:space="preserve">2. Install and run</w:t>
+        <w:t xml:space="preserve">2. Current operator boundary</w:t>
       </w:r>
     </w:p>
     <w:p>
@@ -297,290 +297,13 @@
         <w:pStyle w:val="FirstParagraph"/>
       </w:pPr>
       <w:r>
-        <w:t xml:space="preserve">From the repository root:</w:t>
-      </w:r>
-    </w:p>
-    <w:p>
-      <w:pPr>
-        <w:pStyle w:val="SourceCode"/>
-      </w:pPr>
-      <w:r>
-        <w:rPr>
-          <w:rStyle w:val="ExtensionTok"/>
-        </w:rPr>
-        <w:t xml:space="preserve">uv</w:t>
-      </w:r>
-      <w:r>
-        <w:rPr>
-          <w:rStyle w:val="NormalTok"/>
-        </w:rPr>
-        <w:t xml:space="preserve"> sync </w:t>
-      </w:r>
-      <w:r>
-        <w:rPr>
-          <w:rStyle w:val="AttributeTok"/>
-        </w:rPr>
-        <w:t xml:space="preserve">--project</w:t>
-      </w:r>
-      <w:r>
-        <w:rPr>
-          <w:rStyle w:val="NormalTok"/>
-        </w:rPr>
-        <w:t xml:space="preserve"> globalexposures </w:t>
-      </w:r>
-      <w:r>
-        <w:rPr>
-          <w:rStyle w:val="AttributeTok"/>
-        </w:rPr>
-        <w:t xml:space="preserve">--locked</w:t>
-      </w:r>
-      <w:r>
-        <w:br/>
-      </w:r>
-      <w:r>
-        <w:rPr>
-          <w:rStyle w:val="ExtensionTok"/>
-        </w:rPr>
-        <w:t xml:space="preserve">uv</w:t>
-      </w:r>
-      <w:r>
-        <w:rPr>
-          <w:rStyle w:val="NormalTok"/>
-        </w:rPr>
-        <w:t xml:space="preserve"> run </w:t>
-      </w:r>
-      <w:r>
-        <w:rPr>
-          <w:rStyle w:val="AttributeTok"/>
-        </w:rPr>
-        <w:t xml:space="preserve">--project</w:t>
-      </w:r>
-      <w:r>
-        <w:rPr>
-          <w:rStyle w:val="NormalTok"/>
-        </w:rPr>
-        <w:t xml:space="preserve"> globalexposures python globalexposures/exposures.py </w:t>
-      </w:r>
-      <w:r>
-        <w:rPr>
-          <w:rStyle w:val="AttributeTok"/>
-        </w:rPr>
-        <w:t xml:space="preserve">--help</w:t>
-      </w:r>
-    </w:p>
-    <w:p>
-      <w:pPr>
-        <w:pStyle w:val="FirstParagraph"/>
-      </w:pPr>
-      <w:r>
-        <w:t xml:space="preserve">Run all events with the approved configuration:</w:t>
-      </w:r>
-    </w:p>
-    <w:p>
-      <w:pPr>
-        <w:pStyle w:val="SourceCode"/>
-      </w:pPr>
-      <w:r>
-        <w:rPr>
-          <w:rStyle w:val="ExtensionTok"/>
-        </w:rPr>
-        <w:t xml:space="preserve">uv</w:t>
-      </w:r>
-      <w:r>
-        <w:rPr>
-          <w:rStyle w:val="NormalTok"/>
-        </w:rPr>
-        <w:t xml:space="preserve"> run </w:t>
-      </w:r>
-      <w:r>
-        <w:rPr>
-          <w:rStyle w:val="AttributeTok"/>
-        </w:rPr>
-        <w:t xml:space="preserve">--project</w:t>
-      </w:r>
-      <w:r>
-        <w:rPr>
-          <w:rStyle w:val="NormalTok"/>
-        </w:rPr>
-        <w:t xml:space="preserve"> globalexposures python globalexposures/exposures.py </w:t>
-      </w:r>
-      <w:r>
-        <w:rPr>
-          <w:rStyle w:val="DataTypeTok"/>
-        </w:rPr>
-        <w:t xml:space="preserve">\</w:t>
-      </w:r>
-      <w:r>
-        <w:br/>
-      </w:r>
-      <w:r>
-        <w:rPr>
-          <w:rStyle w:val="NormalTok"/>
-        </w:rPr>
-        <w:t xml:space="preserve">  </w:t>
-      </w:r>
-      <w:r>
-        <w:rPr>
-          <w:rStyle w:val="AttributeTok"/>
-        </w:rPr>
-        <w:t xml:space="preserve">--output-dir</w:t>
-      </w:r>
-      <w:r>
-        <w:rPr>
-          <w:rStyle w:val="NormalTok"/>
-        </w:rPr>
-        <w:t xml:space="preserve"> </w:t>
-      </w:r>
-      <w:r>
-        <w:rPr>
-          <w:rStyle w:val="StringTok"/>
-        </w:rPr>
-        <w:t xml:space="preserve">'&lt;new-run-folder&gt;'</w:t>
-      </w:r>
-    </w:p>
-    <w:p>
-      <w:pPr>
-        <w:pStyle w:val="FirstParagraph"/>
-      </w:pPr>
-      <w:r>
-        <w:t xml:space="preserve">Or select an event and approved overrides (replace the example values):</w:t>
-      </w:r>
-    </w:p>
-    <w:p>
-      <w:pPr>
-        <w:pStyle w:val="SourceCode"/>
-      </w:pPr>
-      <w:r>
-        <w:rPr>
-          <w:rStyle w:val="ExtensionTok"/>
-        </w:rPr>
-        <w:t xml:space="preserve">uv</w:t>
-      </w:r>
-      <w:r>
-        <w:rPr>
-          <w:rStyle w:val="NormalTok"/>
-        </w:rPr>
-        <w:t xml:space="preserve"> run </w:t>
-      </w:r>
-      <w:r>
-        <w:rPr>
-          <w:rStyle w:val="AttributeTok"/>
-        </w:rPr>
-        <w:t xml:space="preserve">--project</w:t>
-      </w:r>
-      <w:r>
-        <w:rPr>
-          <w:rStyle w:val="NormalTok"/>
-        </w:rPr>
-        <w:t xml:space="preserve"> globalexposures python globalexposures/exposures.py </w:t>
-      </w:r>
-      <w:r>
-        <w:rPr>
-          <w:rStyle w:val="DataTypeTok"/>
-        </w:rPr>
-        <w:t xml:space="preserve">\</w:t>
-      </w:r>
-      <w:r>
-        <w:br/>
-      </w:r>
-      <w:r>
-        <w:rPr>
-          <w:rStyle w:val="NormalTok"/>
-        </w:rPr>
-        <w:t xml:space="preserve">  </w:t>
-      </w:r>
-      <w:r>
-        <w:rPr>
-          <w:rStyle w:val="AttributeTok"/>
-        </w:rPr>
-        <w:t xml:space="preserve">--event-id</w:t>
-      </w:r>
-      <w:r>
-        <w:rPr>
-          <w:rStyle w:val="NormalTok"/>
-        </w:rPr>
-        <w:t xml:space="preserve"> 123 </w:t>
-      </w:r>
-      <w:r>
-        <w:rPr>
-          <w:rStyle w:val="AttributeTok"/>
-        </w:rPr>
-        <w:t xml:space="preserve">--peril</w:t>
-      </w:r>
-      <w:r>
-        <w:rPr>
-          <w:rStyle w:val="NormalTok"/>
-        </w:rPr>
-        <w:t xml:space="preserve"> 4 </w:t>
-      </w:r>
-      <w:r>
-        <w:rPr>
-          <w:rStyle w:val="AttributeTok"/>
-        </w:rPr>
-        <w:t xml:space="preserve">--portnum</w:t>
-      </w:r>
-      <w:r>
-        <w:rPr>
-          <w:rStyle w:val="NormalTok"/>
-        </w:rPr>
-        <w:t xml:space="preserve"> PORTFOLIO_NUMBER </w:t>
-      </w:r>
-      <w:r>
-        <w:rPr>
-          <w:rStyle w:val="DataTypeTok"/>
-        </w:rPr>
-        <w:t xml:space="preserve">\</w:t>
-      </w:r>
-      <w:r>
-        <w:br/>
-      </w:r>
-      <w:r>
-        <w:rPr>
-          <w:rStyle w:val="NormalTok"/>
-        </w:rPr>
-        <w:t xml:space="preserve">  </w:t>
-      </w:r>
-      <w:r>
-        <w:rPr>
-          <w:rStyle w:val="AttributeTok"/>
-        </w:rPr>
-        <w:t xml:space="preserve">--output-dir</w:t>
-      </w:r>
-      <w:r>
-        <w:rPr>
-          <w:rStyle w:val="NormalTok"/>
-        </w:rPr>
-        <w:t xml:space="preserve"> </w:t>
-      </w:r>
-      <w:r>
-        <w:rPr>
-          <w:rStyle w:val="StringTok"/>
-        </w:rPr>
-        <w:t xml:space="preserve">'&lt;new-run-folder&gt;'</w:t>
-      </w:r>
-    </w:p>
-    <w:p>
-      <w:pPr>
-        <w:pStyle w:val="FirstParagraph"/>
-      </w:pPr>
-      <w:r>
-        <w:t xml:space="preserve">Do</w:t>
-      </w:r>
-      <w:r>
-        <w:t xml:space="preserve"> </w:t>
-      </w:r>
-      <w:r>
-        <w:rPr>
-          <w:b/>
-          <w:bCs/>
-        </w:rPr>
-        <w:t xml:space="preserve">not</w:t>
-      </w:r>
-      <w:r>
-        <w:t xml:space="preserve"> </w:t>
-      </w:r>
-      <w:r>
-        <w:t xml:space="preserve">use</w:t>
+        <w:t xml:space="preserve">There is currently no approved no-Python SQL/Excel route for the spatial</w:t>
+      </w:r>
+      <w:r>
+        <w:t xml:space="preserve"> </w:t>
+      </w:r>
+      <w:r>
+        <w:t xml:space="preserve">calculation. Do not install Python or</w:t>
       </w:r>
       <w:r>
         <w:t xml:space="preserve"> </w:t>
@@ -589,19 +312,16 @@
         <w:rPr>
           <w:rStyle w:val="VerbatimChar"/>
         </w:rPr>
-        <w:t xml:space="preserve">--allow-missing-pml</w:t>
-      </w:r>
-      <w:r>
-        <w:t xml:space="preserve"> </w:t>
-      </w:r>
-      <w:r>
-        <w:t xml:space="preserve">for production: unknown loss can appear as</w:t>
-      </w:r>
-      <w:r>
-        <w:t xml:space="preserve"> </w:t>
-      </w:r>
-      <w:r>
-        <w:t xml:space="preserve">zero with a successful status. Exit</w:t>
+        <w:t xml:space="preserve">uv</w:t>
+      </w:r>
+      <w:r>
+        <w:t xml:space="preserve">, and do not run this route as an</w:t>
+      </w:r>
+      <w:r>
+        <w:t xml:space="preserve"> </w:t>
+      </w:r>
+      <w:r>
+        <w:t xml:space="preserve">operator workflow. The checked-in implementation remains</w:t>
       </w:r>
       <w:r>
         <w:t xml:space="preserve"> </w:t>
@@ -610,34 +330,33 @@
         <w:rPr>
           <w:rStyle w:val="VerbatimChar"/>
         </w:rPr>
-        <w:t xml:space="preserve">1</w:t>
-      </w:r>
-      <w:r>
-        <w:t xml:space="preserve"> </w:t>
-      </w:r>
-      <w:r>
-        <w:t xml:space="preserve">means pipeline failure;</w:t>
-      </w:r>
-      <w:r>
-        <w:t xml:space="preserve"> </w:t>
-      </w:r>
-      <w:r>
-        <w:rPr>
-          <w:rStyle w:val="VerbatimChar"/>
-        </w:rPr>
-        <w:t xml:space="preserve">2</w:t>
-      </w:r>
-      <w:r>
-        <w:t xml:space="preserve"> </w:t>
-      </w:r>
-      <w:r>
-        <w:t xml:space="preserve">means at</w:t>
-      </w:r>
-      <w:r>
-        <w:t xml:space="preserve"> </w:t>
-      </w:r>
-      <w:r>
-        <w:t xml:space="preserve">least one selected event failed. Do not deliver partial results.</w:t>
+        <w:t xml:space="preserve">globalexposures/exposures.py</w:t>
+      </w:r>
+      <w:r>
+        <w:t xml:space="preserve"> </w:t>
+      </w:r>
+      <w:r>
+        <w:t xml:space="preserve">and is maintainer/developer-only pending an</w:t>
+      </w:r>
+      <w:r>
+        <w:t xml:space="preserve"> </w:t>
+      </w:r>
+      <w:r>
+        <w:t xml:space="preserve">approved SQL Server spatial implementation.</w:t>
+      </w:r>
+    </w:p>
+    <w:p>
+      <w:pPr>
+        <w:pStyle w:val="BodyText"/>
+      </w:pPr>
+      <w:r>
+        <w:t xml:space="preserve">Do not load or deliver Global Exposures results from the current repository</w:t>
+      </w:r>
+      <w:r>
+        <w:t xml:space="preserve"> </w:t>
+      </w:r>
+      <w:r>
+        <w:t xml:space="preserve">without that implementation, its validation evidence, and owner approval.</w:t>
       </w:r>
     </w:p>
     <w:bookmarkEnd w:id="13"/>
@@ -1257,7 +976,7 @@
         <w:rPr>
           <w:rStyle w:val="VerbatimChar"/>
         </w:rPr>
-        <w:t xml:space="preserve">e24909debfc0c491a6ab6bd1b580a3d9d3d02c52</w:t>
+        <w:t xml:space="preserve">7ca91475efc981d1f0bfd8e943e1ef00485716c1</w:t>
       </w:r>
       <w:r>
         <w:t xml:space="preserve"> </w:t>
@@ -1332,7 +1051,7 @@
         <w:rPr>
           <w:rStyle w:val="VerbatimChar"/>
         </w:rPr>
-        <w:t xml:space="preserve">4f5c2cf5ca1f2011c1502e1d803716cbb4320a1af08b147893d96eb3dbcefa35</w:t>
+        <w:t xml:space="preserve">bd070a3f8dd013caf3c8c2e8b150be62bb8a769899562d9a6fe257a4a10f7e17</w:t>
       </w:r>
       <w:r>
         <w:t xml:space="preserve">.</w:t>
@@ -1409,7 +1128,7 @@
               <w:rPr>
                 <w:rStyle w:val="VerbatimChar"/>
               </w:rPr>
-              <w:t xml:space="preserve">c52790257d2b877bfb5f7780f9840503853eb98320bc441f861edd5951cd4d80</w:t>
+              <w:t xml:space="preserve">3d6c09da6f8390ab7167728e33b01b75b4e621ce1403b23d58ce505307b31994</w:t>
             </w:r>
           </w:p>
         </w:tc>

</xml_diff>

<commit_message>
Configure CSV paths in script and separate PRA and BSCR guides
</commit_message>
<xml_diff>
--- a/docs/generated/Global-Exposures-Jan-2026.docx
+++ b/docs/generated/Global-Exposures-Jan-2026.docx
@@ -976,7 +976,7 @@
         <w:rPr>
           <w:rStyle w:val="VerbatimChar"/>
         </w:rPr>
-        <w:t xml:space="preserve">ca6a2330f80faae748db89fc7160bcd90fc90543</w:t>
+        <w:t xml:space="preserve">c8bb3839827c2d81c289b3c92ccac26e24c48725</w:t>
       </w:r>
       <w:r>
         <w:t xml:space="preserve"> </w:t>
@@ -1003,7 +1003,7 @@
         <w:rPr>
           <w:rStyle w:val="VerbatimChar"/>
         </w:rPr>
-        <w:t xml:space="preserve">1437fab170f5c71a3ed62a84a3505227ae3f043edb2dca53bc3ba73a413dbcfb</w:t>
+        <w:t xml:space="preserve">765e4a76df782e41f11d22fbd047c32337d86646f12e7c3af301a86318c6b023</w:t>
       </w:r>
       <w:r>
         <w:t xml:space="preserve">.</w:t>

</xml_diff>

<commit_message>
Run Global Exposures offline from four SQL-exported CSV inputs
</commit_message>
<xml_diff>
--- a/docs/generated/Global-Exposures-Jan-2026.docx
+++ b/docs/generated/Global-Exposures-Jan-2026.docx
@@ -18,67 +18,34 @@
         <w:t xml:space="preserve">January 2026</w:t>
       </w:r>
     </w:p>
-    <w:bookmarkStart w:id="11" w:name="Xf173a19cf37a97f9e9d4edf6fac16f29881593c"/>
+    <w:bookmarkStart w:id="9" w:name="X9a35deb9f5bc2660261eb04ce9070bd60343cdf"/>
     <w:p>
       <w:pPr>
         <w:pStyle w:val="Heading1"/>
       </w:pPr>
       <w:r>
-        <w:t xml:space="preserve">Global Exposures — event exposure files</w:t>
+        <w:t xml:space="preserve">Global Exposures — CSV operator run</w:t>
       </w:r>
     </w:p>
     <w:p>
       <w:pPr>
-        <w:pStyle w:val="FirstParagraph"/>
-      </w:pPr>
-      <w:r>
-        <w:rPr>
-          <w:b/>
-          <w:bCs/>
-        </w:rPr>
-        <w:t xml:space="preserve">Not ready for an operator run:</w:t>
-      </w:r>
-      <w:r>
-        <w:t xml:space="preserve"> </w:t>
-      </w:r>
-      <w:r>
-        <w:t xml:space="preserve">the SQL Server spatial implementation is still required;</w:t>
-      </w:r>
-      <w:r>
-        <w:t xml:space="preserve"> </w:t>
-      </w:r>
-      <w:r>
-        <w:rPr>
-          <w:rStyle w:val="VerbatimChar"/>
-        </w:rPr>
-        <w:t xml:space="preserve">globalexposures/exposures.py</w:t>
-      </w:r>
-      <w:r>
-        <w:t xml:space="preserve"> </w:t>
-      </w:r>
-      <w:r>
-        <w:t xml:space="preserve">remains a maintainer-only calculation, not an approved reporting route.</w:t>
-      </w:r>
-    </w:p>
-    <w:bookmarkStart w:id="9" w:name="global-exposures-runbook-prepare-the-run"/>
-    <w:p>
-      <w:pPr>
-        <w:pStyle w:val="Heading2"/>
-      </w:pPr>
-      <w:r>
-        <w:t xml:space="preserve">Prepare the run</w:t>
-      </w:r>
-    </w:p>
-    <w:p>
-      <w:pPr>
-        <w:pStyle w:val="Compact"/>
         <w:numPr>
           <w:ilvl w:val="0"/>
           <w:numId w:val="1001"/>
         </w:numPr>
       </w:pPr>
       <w:r>
-        <w:t xml:space="preserve">Confirm the annual EDM snapshot and the event, polygon and PML records in</w:t>
+        <w:rPr>
+          <w:b/>
+          <w:bCs/>
+        </w:rPr>
+        <w:t xml:space="preserve">Choose one scope.</w:t>
+      </w:r>
+      <w:r>
+        <w:t xml:space="preserve"> </w:t>
+      </w:r>
+      <w:r>
+        <w:t xml:space="preserve">Open the four files in</w:t>
       </w:r>
       <w:r>
         <w:t xml:space="preserve"> </w:t>
@@ -87,7 +54,34 @@
         <w:rPr>
           <w:rStyle w:val="VerbatimChar"/>
         </w:rPr>
-        <w:t xml:space="preserve">GlobalExposures.data.Events</w:t>
+        <w:t xml:space="preserve">globalexposures/sql/</w:t>
+      </w:r>
+      <w:r>
+        <w:t xml:space="preserve"> </w:t>
+      </w:r>
+      <w:r>
+        <w:t xml:space="preserve">and</w:t>
+      </w:r>
+      <w:r>
+        <w:t xml:space="preserve"> </w:t>
+      </w:r>
+      <w:r>
+        <w:t xml:space="preserve">use the same approved snapshot and event selection for the exports.</w:t>
+      </w:r>
+      <w:r>
+        <w:t xml:space="preserve"> </w:t>
+      </w:r>
+      <w:r>
+        <w:t xml:space="preserve">Run</w:t>
+      </w:r>
+      <w:r>
+        <w:t xml:space="preserve"> </w:t>
+      </w:r>
+      <w:r>
+        <w:rPr>
+          <w:rStyle w:val="VerbatimChar"/>
+        </w:rPr>
+        <w:t xml:space="preserve">events.sql</w:t>
       </w:r>
       <w:r>
         <w:t xml:space="preserve">,</w:t>
@@ -99,7 +93,7 @@
         <w:rPr>
           <w:rStyle w:val="VerbatimChar"/>
         </w:rPr>
-        <w:t xml:space="preserve">ShapeFiles</w:t>
+        <w:t xml:space="preserve">shape-points.sql</w:t>
       </w:r>
       <w:r>
         <w:t xml:space="preserve"> </w:t>
@@ -114,272 +108,777 @@
         <w:rPr>
           <w:rStyle w:val="VerbatimChar"/>
         </w:rPr>
-        <w:t xml:space="preserve">PML</w:t>
+        <w:t xml:space="preserve">pml.sql</w:t>
+      </w:r>
+      <w:r>
+        <w:t xml:space="preserve"> </w:t>
+      </w:r>
+      <w:r>
+        <w:t xml:space="preserve">against</w:t>
+      </w:r>
+      <w:r>
+        <w:t xml:space="preserve"> </w:t>
+      </w:r>
+      <w:r>
+        <w:rPr>
+          <w:rStyle w:val="VerbatimChar"/>
+        </w:rPr>
+        <w:t xml:space="preserve">GlobalExposures</w:t>
       </w:r>
       <w:r>
         <w:t xml:space="preserve">.</w:t>
+      </w:r>
+      <w:r>
+        <w:t xml:space="preserve"> </w:t>
+      </w:r>
+      <w:r>
+        <w:t xml:space="preserve">Run</w:t>
+      </w:r>
+      <w:r>
+        <w:t xml:space="preserve"> </w:t>
+      </w:r>
+      <w:r>
+        <w:rPr>
+          <w:rStyle w:val="VerbatimChar"/>
+        </w:rPr>
+        <w:t xml:space="preserve">edm-exposures.sql</w:t>
+      </w:r>
+      <w:r>
+        <w:t xml:space="preserve"> </w:t>
+      </w:r>
+      <w:r>
+        <w:t xml:space="preserve">against the selected EDM snapshot and export the results as:</w:t>
+      </w:r>
+      <w:r>
+        <w:t xml:space="preserve"> </w:t>
+      </w:r>
+      <w:r>
+        <w:rPr>
+          <w:rStyle w:val="VerbatimChar"/>
+        </w:rPr>
+        <w:t xml:space="preserve">events.csv</w:t>
+      </w:r>
+      <w:r>
+        <w:t xml:space="preserve">,</w:t>
+      </w:r>
+      <w:r>
+        <w:t xml:space="preserve"> </w:t>
+      </w:r>
+      <w:r>
+        <w:rPr>
+          <w:rStyle w:val="VerbatimChar"/>
+        </w:rPr>
+        <w:t xml:space="preserve">shape-points.csv</w:t>
+      </w:r>
+      <w:r>
+        <w:t xml:space="preserve">,</w:t>
+      </w:r>
+      <w:r>
+        <w:t xml:space="preserve"> </w:t>
+      </w:r>
+      <w:r>
+        <w:rPr>
+          <w:rStyle w:val="VerbatimChar"/>
+        </w:rPr>
+        <w:t xml:space="preserve">pml.csv</w:t>
+      </w:r>
+      <w:r>
+        <w:t xml:space="preserve">, and</w:t>
+      </w:r>
+      <w:r>
+        <w:t xml:space="preserve"> </w:t>
+      </w:r>
+      <w:r>
+        <w:rPr>
+          <w:rStyle w:val="VerbatimChar"/>
+        </w:rPr>
+        <w:t xml:space="preserve">edm-exposures.csv</w:t>
+      </w:r>
+      <w:r>
+        <w:t xml:space="preserve">.</w:t>
+      </w:r>
+      <w:r>
+        <w:t xml:space="preserve"> </w:t>
+      </w:r>
+      <w:r>
+        <w:t xml:space="preserve">Use the same</w:t>
+      </w:r>
+      <w:r>
+        <w:t xml:space="preserve"> </w:t>
+      </w:r>
+      <w:r>
+        <w:rPr>
+          <w:rStyle w:val="VerbatimChar"/>
+        </w:rPr>
+        <w:t xml:space="preserve">@event_id</w:t>
+      </w:r>
+      <w:r>
+        <w:t xml:space="preserve"> </w:t>
+      </w:r>
+      <w:r>
+        <w:t xml:space="preserve">in those three queries (</w:t>
+      </w:r>
+      <w:r>
+        <w:rPr>
+          <w:rStyle w:val="VerbatimChar"/>
+        </w:rPr>
+        <w:t xml:space="preserve">NULL</w:t>
+      </w:r>
+      <w:r>
+        <w:t xml:space="preserve"> </w:t>
+      </w:r>
+      <w:r>
+        <w:t xml:space="preserve">means all events);</w:t>
+      </w:r>
+      <w:r>
+        <w:t xml:space="preserve"> </w:t>
+      </w:r>
+      <w:r>
+        <w:t xml:space="preserve">set</w:t>
+      </w:r>
+      <w:r>
+        <w:t xml:space="preserve"> </w:t>
+      </w:r>
+      <w:r>
+        <w:rPr>
+          <w:rStyle w:val="VerbatimChar"/>
+        </w:rPr>
+        <w:t xml:space="preserve">@peril_to_use</w:t>
+      </w:r>
+      <w:r>
+        <w:t xml:space="preserve"> </w:t>
+      </w:r>
+      <w:r>
+        <w:t xml:space="preserve">and</w:t>
+      </w:r>
+      <w:r>
+        <w:t xml:space="preserve"> </w:t>
+      </w:r>
+      <w:r>
+        <w:rPr>
+          <w:rStyle w:val="VerbatimChar"/>
+        </w:rPr>
+        <w:t xml:space="preserve">@portnum_filter</w:t>
+      </w:r>
+      <w:r>
+        <w:t xml:space="preserve"> </w:t>
+      </w:r>
+      <w:r>
+        <w:t xml:space="preserve">in the EDM query for the required exposure scope.</w:t>
       </w:r>
     </w:p>
     <w:p>
       <w:pPr>
-        <w:pStyle w:val="Compact"/>
         <w:numPr>
           <w:ilvl w:val="0"/>
           <w:numId w:val="1001"/>
         </w:numPr>
       </w:pPr>
       <w:r>
-        <w:t xml:space="preserve">Confirm event IDs, polygon validity, coordinates, policy/portfolio rules and independent exposure totals before any calculation.</w:t>
+        <w:rPr>
+          <w:b/>
+          <w:bCs/>
+        </w:rPr>
+        <w:t xml:space="preserve">Place the inputs.</w:t>
+      </w:r>
+      <w:r>
+        <w:t xml:space="preserve"> </w:t>
+      </w:r>
+      <w:r>
+        <w:t xml:space="preserve">Put the four header-bearing CSVs beside</w:t>
+      </w:r>
+      <w:r>
+        <w:t xml:space="preserve"> </w:t>
+      </w:r>
+      <w:r>
+        <w:rPr>
+          <w:rStyle w:val="VerbatimChar"/>
+        </w:rPr>
+        <w:t xml:space="preserve">exposures.py</w:t>
+      </w:r>
+      <w:r>
+        <w:t xml:space="preserve">, or set each constant below to an arbitrary full path. A</w:t>
+      </w:r>
+      <w:r>
+        <w:t xml:space="preserve"> </w:t>
+      </w:r>
+      <w:r>
+        <w:t xml:space="preserve">header-only shape or PML export can be valid for an event; review missing</w:t>
+      </w:r>
+      <w:r>
+        <w:t xml:space="preserve"> </w:t>
+      </w:r>
+      <w:r>
+        <w:t xml:space="preserve">shapes and every</w:t>
+      </w:r>
+      <w:r>
+        <w:t xml:space="preserve"> </w:t>
+      </w:r>
+      <w:r>
+        <w:rPr>
+          <w:rStyle w:val="VerbatimChar"/>
+        </w:rPr>
+        <w:t xml:space="preserve">No impacted exposures</w:t>
+      </w:r>
+      <w:r>
+        <w:t xml:space="preserve"> </w:t>
+      </w:r>
+      <w:r>
+        <w:t xml:space="preserve">result rather than treating them as</w:t>
+      </w:r>
+      <w:r>
+        <w:t xml:space="preserve"> </w:t>
+      </w:r>
+      <w:r>
+        <w:t xml:space="preserve">proof of no impact.</w:t>
       </w:r>
     </w:p>
     <w:p>
       <w:pPr>
-        <w:pStyle w:val="Compact"/>
         <w:numPr>
           <w:ilvl w:val="0"/>
           <w:numId w:val="1001"/>
         </w:numPr>
       </w:pPr>
       <w:r>
-        <w:t xml:space="preserve">Use a new, empty output folder for each run so files from different events or snapshots are not mixed.</w:t>
+        <w:rPr>
+          <w:b/>
+          <w:bCs/>
+        </w:rPr>
+        <w:t xml:space="preserve">Edit the constants at the top of</w:t>
+      </w:r>
+      <w:r>
+        <w:rPr>
+          <w:b/>
+          <w:bCs/>
+        </w:rPr>
+        <w:t xml:space="preserve"> </w:t>
+      </w:r>
+      <w:r>
+        <w:rPr>
+          <w:rStyle w:val="VerbatimChar"/>
+          <w:b/>
+          <w:bCs/>
+        </w:rPr>
+        <w:t xml:space="preserve">exposures.py</w:t>
+      </w:r>
+      <w:r>
+        <w:rPr>
+          <w:b/>
+          <w:bCs/>
+        </w:rPr>
+        <w:t xml:space="preserve">.</w:t>
+      </w:r>
+      <w:r>
+        <w:t xml:space="preserve"> </w:t>
+      </w:r>
+      <w:r>
+        <w:t xml:space="preserve">Use a new or empty</w:t>
+      </w:r>
+      <w:r>
+        <w:t xml:space="preserve"> </w:t>
+      </w:r>
+      <w:r>
+        <w:t xml:space="preserve">output folder and keep the paths and event selection explicit:</w:t>
       </w:r>
     </w:p>
     <w:p>
       <w:pPr>
-        <w:pStyle w:val="Compact"/>
+        <w:pStyle w:val="SourceCode"/>
+        <w:numPr>
+          <w:ilvl w:val="0"/>
+          <w:numId w:val="1000"/>
+        </w:numPr>
+      </w:pPr>
+      <w:r>
+        <w:rPr>
+          <w:rStyle w:val="NormalTok"/>
+        </w:rPr>
+        <w:t xml:space="preserve">EVENTS_INPUT_CSV </w:t>
+      </w:r>
+      <w:r>
+        <w:rPr>
+          <w:rStyle w:val="OperatorTok"/>
+        </w:rPr>
+        <w:t xml:space="preserve">=</w:t>
+      </w:r>
+      <w:r>
+        <w:rPr>
+          <w:rStyle w:val="NormalTok"/>
+        </w:rPr>
+        <w:t xml:space="preserve"> Path(</w:t>
+      </w:r>
+      <w:r>
+        <w:rPr>
+          <w:rStyle w:val="VariableTok"/>
+        </w:rPr>
+        <w:t xml:space="preserve">__file__</w:t>
+      </w:r>
+      <w:r>
+        <w:rPr>
+          <w:rStyle w:val="NormalTok"/>
+        </w:rPr>
+        <w:t xml:space="preserve">).with_name(</w:t>
+      </w:r>
+      <w:r>
+        <w:rPr>
+          <w:rStyle w:val="StringTok"/>
+        </w:rPr>
+        <w:t xml:space="preserve">"events.csv"</w:t>
+      </w:r>
+      <w:r>
+        <w:rPr>
+          <w:rStyle w:val="NormalTok"/>
+        </w:rPr>
+        <w:t xml:space="preserve">)</w:t>
+      </w:r>
+      <w:r>
+        <w:br/>
+      </w:r>
+      <w:r>
+        <w:rPr>
+          <w:rStyle w:val="NormalTok"/>
+        </w:rPr>
+        <w:t xml:space="preserve">SHAPE_POINTS_INPUT_CSV </w:t>
+      </w:r>
+      <w:r>
+        <w:rPr>
+          <w:rStyle w:val="OperatorTok"/>
+        </w:rPr>
+        <w:t xml:space="preserve">=</w:t>
+      </w:r>
+      <w:r>
+        <w:rPr>
+          <w:rStyle w:val="NormalTok"/>
+        </w:rPr>
+        <w:t xml:space="preserve"> Path(</w:t>
+      </w:r>
+      <w:r>
+        <w:rPr>
+          <w:rStyle w:val="VariableTok"/>
+        </w:rPr>
+        <w:t xml:space="preserve">__file__</w:t>
+      </w:r>
+      <w:r>
+        <w:rPr>
+          <w:rStyle w:val="NormalTok"/>
+        </w:rPr>
+        <w:t xml:space="preserve">).with_name(</w:t>
+      </w:r>
+      <w:r>
+        <w:rPr>
+          <w:rStyle w:val="StringTok"/>
+        </w:rPr>
+        <w:t xml:space="preserve">"shape-points.csv"</w:t>
+      </w:r>
+      <w:r>
+        <w:rPr>
+          <w:rStyle w:val="NormalTok"/>
+        </w:rPr>
+        <w:t xml:space="preserve">)</w:t>
+      </w:r>
+      <w:r>
+        <w:br/>
+      </w:r>
+      <w:r>
+        <w:rPr>
+          <w:rStyle w:val="NormalTok"/>
+        </w:rPr>
+        <w:t xml:space="preserve">PML_INPUT_CSV </w:t>
+      </w:r>
+      <w:r>
+        <w:rPr>
+          <w:rStyle w:val="OperatorTok"/>
+        </w:rPr>
+        <w:t xml:space="preserve">=</w:t>
+      </w:r>
+      <w:r>
+        <w:rPr>
+          <w:rStyle w:val="NormalTok"/>
+        </w:rPr>
+        <w:t xml:space="preserve"> Path(</w:t>
+      </w:r>
+      <w:r>
+        <w:rPr>
+          <w:rStyle w:val="VariableTok"/>
+        </w:rPr>
+        <w:t xml:space="preserve">__file__</w:t>
+      </w:r>
+      <w:r>
+        <w:rPr>
+          <w:rStyle w:val="NormalTok"/>
+        </w:rPr>
+        <w:t xml:space="preserve">).with_name(</w:t>
+      </w:r>
+      <w:r>
+        <w:rPr>
+          <w:rStyle w:val="StringTok"/>
+        </w:rPr>
+        <w:t xml:space="preserve">"pml.csv"</w:t>
+      </w:r>
+      <w:r>
+        <w:rPr>
+          <w:rStyle w:val="NormalTok"/>
+        </w:rPr>
+        <w:t xml:space="preserve">)</w:t>
+      </w:r>
+      <w:r>
+        <w:br/>
+      </w:r>
+      <w:r>
+        <w:rPr>
+          <w:rStyle w:val="NormalTok"/>
+        </w:rPr>
+        <w:t xml:space="preserve">EDM_INPUT_CSV </w:t>
+      </w:r>
+      <w:r>
+        <w:rPr>
+          <w:rStyle w:val="OperatorTok"/>
+        </w:rPr>
+        <w:t xml:space="preserve">=</w:t>
+      </w:r>
+      <w:r>
+        <w:rPr>
+          <w:rStyle w:val="NormalTok"/>
+        </w:rPr>
+        <w:t xml:space="preserve"> Path(</w:t>
+      </w:r>
+      <w:r>
+        <w:rPr>
+          <w:rStyle w:val="VariableTok"/>
+        </w:rPr>
+        <w:t xml:space="preserve">__file__</w:t>
+      </w:r>
+      <w:r>
+        <w:rPr>
+          <w:rStyle w:val="NormalTok"/>
+        </w:rPr>
+        <w:t xml:space="preserve">).with_name(</w:t>
+      </w:r>
+      <w:r>
+        <w:rPr>
+          <w:rStyle w:val="StringTok"/>
+        </w:rPr>
+        <w:t xml:space="preserve">"edm-exposures.csv"</w:t>
+      </w:r>
+      <w:r>
+        <w:rPr>
+          <w:rStyle w:val="NormalTok"/>
+        </w:rPr>
+        <w:t xml:space="preserve">)</w:t>
+      </w:r>
+      <w:r>
+        <w:br/>
+      </w:r>
+      <w:r>
+        <w:rPr>
+          <w:rStyle w:val="NormalTok"/>
+        </w:rPr>
+        <w:t xml:space="preserve">OUTPUT_DIR </w:t>
+      </w:r>
+      <w:r>
+        <w:rPr>
+          <w:rStyle w:val="OperatorTok"/>
+        </w:rPr>
+        <w:t xml:space="preserve">=</w:t>
+      </w:r>
+      <w:r>
+        <w:rPr>
+          <w:rStyle w:val="NormalTok"/>
+        </w:rPr>
+        <w:t xml:space="preserve"> Path(</w:t>
+      </w:r>
+      <w:r>
+        <w:rPr>
+          <w:rStyle w:val="VariableTok"/>
+        </w:rPr>
+        <w:t xml:space="preserve">__file__</w:t>
+      </w:r>
+      <w:r>
+        <w:rPr>
+          <w:rStyle w:val="NormalTok"/>
+        </w:rPr>
+        <w:t xml:space="preserve">).with_name(</w:t>
+      </w:r>
+      <w:r>
+        <w:rPr>
+          <w:rStyle w:val="StringTok"/>
+        </w:rPr>
+        <w:t xml:space="preserve">"global_exposures_outputs"</w:t>
+      </w:r>
+      <w:r>
+        <w:rPr>
+          <w:rStyle w:val="NormalTok"/>
+        </w:rPr>
+        <w:t xml:space="preserve">)</w:t>
+      </w:r>
+      <w:r>
+        <w:br/>
+      </w:r>
+      <w:r>
+        <w:rPr>
+          <w:rStyle w:val="NormalTok"/>
+        </w:rPr>
+        <w:t xml:space="preserve">EVENT_ID_TO_RUN </w:t>
+      </w:r>
+      <w:r>
+        <w:rPr>
+          <w:rStyle w:val="OperatorTok"/>
+        </w:rPr>
+        <w:t xml:space="preserve">=</w:t>
+      </w:r>
+      <w:r>
+        <w:rPr>
+          <w:rStyle w:val="NormalTok"/>
+        </w:rPr>
+        <w:t xml:space="preserve"> </w:t>
+      </w:r>
+      <w:r>
+        <w:rPr>
+          <w:rStyle w:val="VariableTok"/>
+        </w:rPr>
+        <w:t xml:space="preserve">None</w:t>
+      </w:r>
+      <w:r>
+        <w:rPr>
+          <w:rStyle w:val="NormalTok"/>
+        </w:rPr>
+        <w:t xml:space="preserve">  </w:t>
+      </w:r>
+      <w:r>
+        <w:rPr>
+          <w:rStyle w:val="CommentTok"/>
+        </w:rPr>
+        <w:t xml:space="preserve"># or one approved EventID</w:t>
+      </w:r>
+    </w:p>
+    <w:p>
+      <w:pPr>
         <w:numPr>
           <w:ilvl w:val="0"/>
           <w:numId w:val="1001"/>
         </w:numPr>
       </w:pPr>
       <w:r>
-        <w:t xml:space="preserve">Do not run or deliver this as an operator process until the spatial implementation, validation evidence and source rules have been approved.</w:t>
+        <w:rPr>
+          <w:b/>
+          <w:bCs/>
+        </w:rPr>
+        <w:t xml:space="preserve">Run from</w:t>
+      </w:r>
+      <w:r>
+        <w:rPr>
+          <w:b/>
+          <w:bCs/>
+        </w:rPr>
+        <w:t xml:space="preserve"> </w:t>
+      </w:r>
+      <w:r>
+        <w:rPr>
+          <w:rStyle w:val="VerbatimChar"/>
+          <w:b/>
+          <w:bCs/>
+        </w:rPr>
+        <w:t xml:space="preserve">globalexposures/</w:t>
+      </w:r>
+      <w:r>
+        <w:rPr>
+          <w:b/>
+          <w:bCs/>
+        </w:rPr>
+        <w:t xml:space="preserve">.</w:t>
+      </w:r>
+      <w:r>
+        <w:t xml:space="preserve"> </w:t>
+      </w:r>
+      <w:r>
+        <w:t xml:space="preserve">Use no CLI flags and no local virtual</w:t>
+      </w:r>
+      <w:r>
+        <w:t xml:space="preserve"> </w:t>
+      </w:r>
+      <w:r>
+        <w:t xml:space="preserve">environment:</w:t>
+      </w:r>
+    </w:p>
+    <w:p>
+      <w:pPr>
+        <w:pStyle w:val="SourceCode"/>
+        <w:numPr>
+          <w:ilvl w:val="0"/>
+          <w:numId w:val="1000"/>
+        </w:numPr>
+      </w:pPr>
+      <w:r>
+        <w:rPr>
+          <w:rStyle w:val="ExtensionTok"/>
+        </w:rPr>
+        <w:t xml:space="preserve">uv</w:t>
+      </w:r>
+      <w:r>
+        <w:rPr>
+          <w:rStyle w:val="NormalTok"/>
+        </w:rPr>
+        <w:t xml:space="preserve"> run </w:t>
+      </w:r>
+      <w:r>
+        <w:rPr>
+          <w:rStyle w:val="AttributeTok"/>
+        </w:rPr>
+        <w:t xml:space="preserve">--no-project</w:t>
+      </w:r>
+      <w:r>
+        <w:rPr>
+          <w:rStyle w:val="NormalTok"/>
+        </w:rPr>
+        <w:t xml:space="preserve"> </w:t>
+      </w:r>
+      <w:r>
+        <w:rPr>
+          <w:rStyle w:val="AttributeTok"/>
+        </w:rPr>
+        <w:t xml:space="preserve">--with-requirements</w:t>
+      </w:r>
+      <w:r>
+        <w:rPr>
+          <w:rStyle w:val="NormalTok"/>
+        </w:rPr>
+        <w:t xml:space="preserve"> requirements.txt python exposures.py</w:t>
+      </w:r>
+    </w:p>
+    <w:p>
+      <w:pPr>
+        <w:numPr>
+          <w:ilvl w:val="0"/>
+          <w:numId w:val="1001"/>
+        </w:numPr>
+      </w:pPr>
+      <w:r>
+        <w:rPr>
+          <w:b/>
+          <w:bCs/>
+        </w:rPr>
+        <w:t xml:space="preserve">Inspect the complete output pack.</w:t>
+      </w:r>
+      <w:r>
+        <w:t xml:space="preserve"> </w:t>
+      </w:r>
+      <w:r>
+        <w:t xml:space="preserve">Review the summary, run and error</w:t>
+      </w:r>
+      <w:r>
+        <w:t xml:space="preserve"> </w:t>
+      </w:r>
+      <w:r>
+        <w:t xml:space="preserve">logs,</w:t>
+      </w:r>
+      <w:r>
+        <w:t xml:space="preserve"> </w:t>
+      </w:r>
+      <w:r>
+        <w:rPr>
+          <w:rStyle w:val="VerbatimChar"/>
+        </w:rPr>
+        <w:t xml:space="preserve">*_location_rows.csv</w:t>
+      </w:r>
+      <w:r>
+        <w:t xml:space="preserve">, both breakdown files, and</w:t>
+      </w:r>
+      <w:r>
+        <w:t xml:space="preserve"> </w:t>
+      </w:r>
+      <w:r>
+        <w:rPr>
+          <w:rStyle w:val="VerbatimChar"/>
+        </w:rPr>
+        <w:t xml:space="preserve">edm_exposures.csv</w:t>
+      </w:r>
+      <w:r>
+        <w:t xml:space="preserve">.</w:t>
+      </w:r>
+      <w:r>
+        <w:t xml:space="preserve"> </w:t>
+      </w:r>
+      <w:r>
+        <w:t xml:space="preserve">Account for each selected event and reconcile totals. Missing PML is an</w:t>
+      </w:r>
+      <w:r>
+        <w:t xml:space="preserve"> </w:t>
+      </w:r>
+      <w:r>
+        <w:t xml:space="preserve">event failure. Boundary points count as impacted; an exposure in multiple</w:t>
+      </w:r>
+      <w:r>
+        <w:t xml:space="preserve"> </w:t>
+      </w:r>
+      <w:r>
+        <w:t xml:space="preserve">polygons keeps only the highest-PML match (then lowest</w:t>
+      </w:r>
+      <w:r>
+        <w:t xml:space="preserve"> </w:t>
+      </w:r>
+      <w:r>
+        <w:rPr>
+          <w:rStyle w:val="VerbatimChar"/>
+        </w:rPr>
+        <w:t xml:space="preserve">PolygonID</w:t>
+      </w:r>
+      <w:r>
+        <w:t xml:space="preserve">), not an</w:t>
+      </w:r>
+      <w:r>
+        <w:t xml:space="preserve"> </w:t>
+      </w:r>
+      <w:r>
+        <w:t xml:space="preserve">additive overlap. Investigate invalid or dropped coordinates, repaired</w:t>
+      </w:r>
+      <w:r>
+        <w:t xml:space="preserve"> </w:t>
+      </w:r>
+      <w:r>
+        <w:t xml:space="preserve">geometry, multiplied post-join exposure, and every zero result before</w:t>
+      </w:r>
+      <w:r>
+        <w:t xml:space="preserve"> </w:t>
+      </w:r>
+      <w:r>
+        <w:t xml:space="preserve">delivery. Keep inputs, constants, command, outputs, and reconciliations</w:t>
+      </w:r>
+      <w:r>
+        <w:t xml:space="preserve"> </w:t>
+      </w:r>
+      <w:r>
+        <w:t xml:space="preserve">together.</w:t>
+      </w:r>
+      <w:r>
+        <w:t xml:space="preserve"> </w:t>
+      </w:r>
+      <w:r>
+        <w:t xml:space="preserve">A</w:t>
+      </w:r>
+      <w:r>
+        <w:t xml:space="preserve"> </w:t>
+      </w:r>
+      <w:r>
+        <w:rPr>
+          <w:rStyle w:val="VerbatimChar"/>
+        </w:rPr>
+        <w:t xml:space="preserve">Complete</w:t>
+      </w:r>
+      <w:r>
+        <w:t xml:space="preserve"> </w:t>
+      </w:r>
+      <w:r>
+        <w:t xml:space="preserve">summary is processing status only; it does not approve a zero</w:t>
+      </w:r>
+      <w:r>
+        <w:t xml:space="preserve"> </w:t>
+      </w:r>
+      <w:r>
+        <w:t xml:space="preserve">result or establish that monetary totals are complete.</w:t>
       </w:r>
     </w:p>
     <w:bookmarkEnd w:id="9"/>
-    <w:bookmarkStart w:id="10" w:name="X21c8c4728cdc13c3bc79ccccb7044b0cf8e948a"/>
-    <w:p>
-      <w:pPr>
-        <w:pStyle w:val="Heading2"/>
-      </w:pPr>
-      <w:r>
-        <w:t xml:space="preserve">Check a supplied calculation pack</w:t>
-      </w:r>
-    </w:p>
-    <w:p>
-      <w:pPr>
-        <w:pStyle w:val="Compact"/>
-        <w:numPr>
-          <w:ilvl w:val="0"/>
-          <w:numId w:val="1002"/>
-        </w:numPr>
-      </w:pPr>
-      <w:r>
-        <w:t xml:space="preserve">Read</w:t>
-      </w:r>
-      <w:r>
-        <w:t xml:space="preserve"> </w:t>
-      </w:r>
-      <w:r>
-        <w:rPr>
-          <w:rStyle w:val="VerbatimChar"/>
-        </w:rPr>
-        <w:t xml:space="preserve">*_summary.csv</w:t>
-      </w:r>
-      <w:r>
-        <w:t xml:space="preserve"> </w:t>
-      </w:r>
-      <w:r>
-        <w:t xml:space="preserve">for status and event counts, not monetary totals.</w:t>
-      </w:r>
-    </w:p>
-    <w:p>
-      <w:pPr>
-        <w:pStyle w:val="Compact"/>
-        <w:numPr>
-          <w:ilvl w:val="0"/>
-          <w:numId w:val="1002"/>
-        </w:numPr>
-      </w:pPr>
-      <w:r>
-        <w:t xml:space="preserve">Check</w:t>
-      </w:r>
-      <w:r>
-        <w:t xml:space="preserve"> </w:t>
-      </w:r>
-      <w:r>
-        <w:rPr>
-          <w:rStyle w:val="VerbatimChar"/>
-        </w:rPr>
-        <w:t xml:space="preserve">*_run_log.csv</w:t>
-      </w:r>
-      <w:r>
-        <w:t xml:space="preserve"> </w:t>
-      </w:r>
-      <w:r>
-        <w:t xml:space="preserve">and</w:t>
-      </w:r>
-      <w:r>
-        <w:t xml:space="preserve"> </w:t>
-      </w:r>
-      <w:r>
-        <w:rPr>
-          <w:rStyle w:val="VerbatimChar"/>
-        </w:rPr>
-        <w:t xml:space="preserve">*_error_log.csv</w:t>
-      </w:r>
-      <w:r>
-        <w:t xml:space="preserve"> </w:t>
-      </w:r>
-      <w:r>
-        <w:t xml:space="preserve">and account for every selected event.</w:t>
-      </w:r>
-    </w:p>
-    <w:p>
-      <w:pPr>
-        <w:pStyle w:val="Compact"/>
-        <w:numPr>
-          <w:ilvl w:val="0"/>
-          <w:numId w:val="1002"/>
-        </w:numPr>
-      </w:pPr>
-      <w:r>
-        <w:t xml:space="preserve">Reconcile</w:t>
-      </w:r>
-      <w:r>
-        <w:t xml:space="preserve"> </w:t>
-      </w:r>
-      <w:r>
-        <w:rPr>
-          <w:rStyle w:val="VerbatimChar"/>
-        </w:rPr>
-        <w:t xml:space="preserve">edm_exposures.csv</w:t>
-      </w:r>
-      <w:r>
-        <w:t xml:space="preserve"> </w:t>
-      </w:r>
-      <w:r>
-        <w:t xml:space="preserve">to independent EDM totals.</w:t>
-      </w:r>
-    </w:p>
-    <w:p>
-      <w:pPr>
-        <w:pStyle w:val="Compact"/>
-        <w:numPr>
-          <w:ilvl w:val="0"/>
-          <w:numId w:val="1002"/>
-        </w:numPr>
-      </w:pPr>
-      <w:r>
-        <w:t xml:space="preserve">Reconcile</w:t>
-      </w:r>
-      <w:r>
-        <w:t xml:space="preserve"> </w:t>
-      </w:r>
-      <w:r>
-        <w:rPr>
-          <w:rStyle w:val="VerbatimChar"/>
-        </w:rPr>
-        <w:t xml:space="preserve">*_account_breakdown.csv</w:t>
-      </w:r>
-      <w:r>
-        <w:t xml:space="preserve"> </w:t>
-      </w:r>
-      <w:r>
-        <w:t xml:space="preserve">and</w:t>
-      </w:r>
-      <w:r>
-        <w:t xml:space="preserve"> </w:t>
-      </w:r>
-      <w:r>
-        <w:rPr>
-          <w:rStyle w:val="VerbatimChar"/>
-        </w:rPr>
-        <w:t xml:space="preserve">*_location_breakout.csv</w:t>
-      </w:r>
-      <w:r>
-        <w:t xml:space="preserve"> </w:t>
-      </w:r>
-      <w:r>
-        <w:t xml:space="preserve">to the impacted-location detail in</w:t>
-      </w:r>
-      <w:r>
-        <w:t xml:space="preserve"> </w:t>
-      </w:r>
-      <w:r>
-        <w:rPr>
-          <w:rStyle w:val="VerbatimChar"/>
-        </w:rPr>
-        <w:t xml:space="preserve">*_location_rows.csv</w:t>
-      </w:r>
-      <w:r>
-        <w:t xml:space="preserve">.</w:t>
-      </w:r>
-    </w:p>
-    <w:p>
-      <w:pPr>
-        <w:pStyle w:val="Compact"/>
-        <w:numPr>
-          <w:ilvl w:val="0"/>
-          <w:numId w:val="1002"/>
-        </w:numPr>
-      </w:pPr>
-      <w:r>
-        <w:t xml:space="preserve">Investigate missing files or headers, multiplied exposure, invalid geometry/PML, missing policy factors and every zero/no-impact result.</w:t>
-      </w:r>
-    </w:p>
-    <w:p>
-      <w:pPr>
-        <w:pStyle w:val="Compact"/>
-        <w:numPr>
-          <w:ilvl w:val="0"/>
-          <w:numId w:val="1002"/>
-        </w:numPr>
-      </w:pPr>
-      <w:r>
-        <w:t xml:space="preserve">Accept a zero only with independent evidence of no impact, and do not sum overlapping events without an agreed rule.</w:t>
-      </w:r>
-    </w:p>
-    <w:p>
-      <w:pPr>
-        <w:pStyle w:val="Compact"/>
-        <w:numPr>
-          <w:ilvl w:val="0"/>
-          <w:numId w:val="1002"/>
-        </w:numPr>
-      </w:pPr>
-      <w:r>
-        <w:t xml:space="preserve">Keep the full CSV pack, source settings, calculation command and reconciliations together.</w:t>
-      </w:r>
-    </w:p>
-    <w:p>
-      <w:pPr>
-        <w:pStyle w:val="FirstParagraph"/>
-      </w:pPr>
-      <w:r>
-        <w:t xml:space="preserve">There is no Excel-loading step for this process; a CSV pack alone does not establish that every event was calculated correctly.</w:t>
-      </w:r>
-    </w:p>
-    <w:p>
-      <w:pPr>
-        <w:pStyle w:val="BodyText"/>
-      </w:pPr>
-      <w:r>
-        <w:rPr>
-          <w:b/>
-          <w:bCs/>
-        </w:rPr>
-        <w:t xml:space="preserve">To return to later:</w:t>
-      </w:r>
-      <w:r>
-        <w:t xml:space="preserve"> </w:t>
-      </w:r>
-      <w:r>
-        <w:t xml:space="preserve">finish and validate the SQL Server spatial route before using this process for reporting.</w:t>
-      </w:r>
-    </w:p>
-    <w:bookmarkEnd w:id="10"/>
-    <w:bookmarkEnd w:id="11"/>
     <w:sectPr>
       <w:footnotePr>
         <w:numRestart w:val="eachSect"/>
@@ -579,36 +1078,6 @@
     <w:abstractNumId w:val="990"/>
   </w:num>
   <w:num w:numId="1001">
-    <w:abstractNumId w:val="99411"/>
-    <w:lvlOverride w:ilvl="0">
-      <w:startOverride w:val="1"/>
-    </w:lvlOverride>
-    <w:lvlOverride w:ilvl="1">
-      <w:startOverride w:val="1"/>
-    </w:lvlOverride>
-    <w:lvlOverride w:ilvl="2">
-      <w:startOverride w:val="1"/>
-    </w:lvlOverride>
-    <w:lvlOverride w:ilvl="3">
-      <w:startOverride w:val="1"/>
-    </w:lvlOverride>
-    <w:lvlOverride w:ilvl="4">
-      <w:startOverride w:val="1"/>
-    </w:lvlOverride>
-    <w:lvlOverride w:ilvl="5">
-      <w:startOverride w:val="1"/>
-    </w:lvlOverride>
-    <w:lvlOverride w:ilvl="6">
-      <w:startOverride w:val="1"/>
-    </w:lvlOverride>
-    <w:lvlOverride w:ilvl="7">
-      <w:startOverride w:val="1"/>
-    </w:lvlOverride>
-    <w:lvlOverride w:ilvl="8">
-      <w:startOverride w:val="1"/>
-    </w:lvlOverride>
-  </w:num>
-  <w:num w:numId="1002">
     <w:abstractNumId w:val="99411"/>
     <w:lvlOverride w:ilvl="0">
       <w:startOverride w:val="1"/>

</xml_diff>